<commit_message>
LaHaus base: recorte para caber en 5 bloques (analogia unica, B2 y hostiles mas cortos)
</commit_message>
<xml_diff>
--- a/recursos/comercial/plataforma LaHaus/BASE_LAHAUS_BLOQUES_5000_2026-10-06_v2.docx
+++ b/recursos/comercial/plataforma LaHaus/BASE_LAHAUS_BLOQUES_5000_2026-10-06_v2.docx
@@ -34,7 +34,7 @@
           <w:color w:val="E54C09"/>
           <w:sz w:val="24"/>
         </w:rPr>
-        <w:t>BLOQUE 1 DE 6  ·  4,779 caracteres  ·  pegar en la carga manual #1 (reemplaza todo)</w:t>
+        <w:t>BLOQUE 1 DE 5  ·  4,779 caracteres  ·  pegar en la carga manual #1 (reemplaza todo)</w:t>
       </w:r>
     </w:p>
     <w:p>
@@ -336,7 +336,7 @@
           <w:color w:val="E54C09"/>
           <w:sz w:val="24"/>
         </w:rPr>
-        <w:t>BLOQUE 2 DE 6  ·  4,758 caracteres  ·  pegar en la carga manual #2 (reemplaza todo)</w:t>
+        <w:t>BLOQUE 2 DE 5  ·  4,758 caracteres  ·  pegar en la carga manual #2 (reemplaza todo)</w:t>
       </w:r>
     </w:p>
     <w:p>
@@ -626,7 +626,7 @@
           <w:color w:val="E54C09"/>
           <w:sz w:val="24"/>
         </w:rPr>
-        <w:t>BLOQUE 3 DE 6  ·  4,682 caracteres  ·  pegar en la carga manual #3 (reemplaza todo)</w:t>
+        <w:t>BLOQUE 3 DE 5  ·  4,682 caracteres  ·  pegar en la carga manual #3 (reemplaza todo)</w:t>
       </w:r>
     </w:p>
     <w:p>
@@ -861,7 +861,7 @@
           <w:color w:val="E54C09"/>
           <w:sz w:val="24"/>
         </w:rPr>
-        <w:t>BLOQUE 4 DE 6  ·  4,569 caracteres  ·  pegar en la carga manual #4 (reemplaza todo)</w:t>
+        <w:t>BLOQUE 4 DE 5  ·  4,569 caracteres  ·  pegar en la carga manual #4 (reemplaza todo)</w:t>
       </w:r>
     </w:p>
     <w:p>
@@ -1095,7 +1095,7 @@
           <w:color w:val="E54C09"/>
           <w:sz w:val="24"/>
         </w:rPr>
-        <w:t>BLOQUE 5 DE 6  ·  4,346 caracteres  ·  pegar en la carga manual #5 (reemplaza todo)</w:t>
+        <w:t>BLOQUE 5 DE 5  ·  4,533 caracteres  ·  pegar en la carga manual #5 (reemplaza todo)</w:t>
       </w:r>
     </w:p>
     <w:p>
@@ -1228,7 +1228,7 @@
         <w:rPr>
           <w:sz w:val="20"/>
         </w:rPr>
-        <w:t>• A2 (110 h): futuro, condicionales, pasados, presente perfecto, pasiva, comparativos; entrevista de trabajo, viajes, hotel, tienda, restaurante, servicio al cliente, reuniones. Cierra con la presentación "MY LIFE" y el Módulo de Graduación (Emprendedor o Pasaporte). Nunca prometer visa, plaza ni empleo.</w:t>
+        <w:t>• A2 (110 h): futuro, condicionales, pasados, presente perfecto, comparativos; entrevista de trabajo, viajes, hotel, tienda, servicio al cliente, reuniones. Cierra con la presentación "MY LIFE" y el Módulo de Graduación. Nunca prometer visa, plaza ni empleo.</w:t>
       </w:r>
     </w:p>
     <w:p>
@@ -1250,7 +1250,7 @@
         <w:rPr>
           <w:sz w:val="20"/>
         </w:rPr>
-        <w:t>• B2 (200 h): conversacional y profesional: vida real (quejas, médico, arriendo, banco, llamadas) y mundo laboral (networking, entrevistas difíciles, presentar una idea, cliente molesto, negociación, feedback, pitch de 90 segundos, pedir un aumento). Cierra con un simulacro de jornada de trabajo en inglés. Con el programa completo: REFUERZO PRO al final.</w:t>
+        <w:t>• B2 (200 h): conversacional y profesional: vida real (quejas, médico, banco, llamadas) y mundo laboral (networking, entrevistas difíciles, presentar una idea, negociación, feedback, pedir un aumento). Cierra con un simulacro de jornada de trabajo en inglés. Con el programa completo: REFUERZO PRO.</w:t>
       </w:r>
     </w:p>
     <w:p>
@@ -1283,22 +1283,7 @@
         <w:rPr>
           <w:sz w:val="20"/>
         </w:rPr>
-        <w:t>• Queja real con enojo: no se discute. "Te entiendo, y eso necesita una respuesta seria de una persona del equipo. ¿Tuviste una experiencia con nosotros o es algo general?" Propia → se registra y se escala hoy. Insulto genérico: una oportunidad ("Estoy para ayudarte; si prefieres te conecto con una persona del equipo"); si persiste, cierre respetuoso y registro. Agresión sostenida o angustia grave: no se vende; "Voy a dejar la conversación aquí. Si más adelante quieres retomarla, aquí estamos", y revisión humana.</w:t>
-      </w:r>
-    </w:p>
-    <w:p>
-      <w:r>
-        <w:br w:type="page"/>
-      </w:r>
-    </w:p>
-    <w:p>
-      <w:r>
-        <w:rPr>
-          <w:b/>
-          <w:color w:val="E54C09"/>
-          <w:sz w:val="24"/>
-        </w:rPr>
-        <w:t>BLOQUE 6 DE 6  ·  495 caracteres  ·  pegar en la carga manual #6 (reemplaza todo)</w:t>
+        <w:t>• Queja con enojo: no se discute. "Te entiendo, y eso necesita una respuesta seria de una persona del equipo. ¿Tuviste una experiencia con nosotros o es algo general?" Propia → se registra y se escala hoy. Insulto: una oportunidad ("Estoy para ayudarte; si prefieres te conecto con una persona del equipo"); si persiste, cierre respetuoso. Agresión sostenida o angustia grave: no se vende, "Voy a dejar la conversación aquí; si quieres retomarla, aquí estamos", y revisión humana.</w:t>
       </w:r>
     </w:p>
     <w:p>
@@ -1309,7 +1294,7 @@
         <w:rPr>
           <w:sz w:val="20"/>
         </w:rPr>
-        <w:t>• Analogías (UNA por conversación, cuando digan "mucha repetición", "¿para qué tanto video?" o "quiero algo más rápido"): El nadador: para bajar un segundo nada miles de piscinas iguales; nadie le dice que es aburrido, es entrenamiento; el video diario son tus piscinas. El gimnasio: nadie cambia el cuerpo en tres visitas, y el que va todos los días sí; por eso la garantía pide asistencia y constancia. Siempre se cierra conectando con lo nuestro: el video diario, la asistencia, la garantía.</w:t>
+        <w:t>• Analogía (una sola, cuando digan "mucha repetición", "¿para qué tanto video?" o "quiero algo más rápido"): el nadador: para bajar un segundo nada miles de piscinas iguales; nadie le dice que es aburrido, es entrenamiento; el video diario son tus piscinas. Se cierra conectando con el video diario, la asistencia y la garantía.</w:t>
       </w:r>
     </w:p>
     <w:p>

</xml_diff>